<commit_message>
Refine Foster resume per UW writing guide
</commit_message>
<xml_diff>
--- a/Sukwoo_Chung_Resume_Foster.docx
+++ b/Sukwoo_Chung_Resume_Foster.docx
@@ -298,7 +298,7 @@
           <w:sz w:val="20"/>
           <w:szCs w:val="20"/>
         </w:rPr>
-        <w:t xml:space="preserve">Design dashboards and retention tracking for a cosmetics express initiative targeting Korea-to-U.S./Japan demand</w:t>
+        <w:t xml:space="preserve">Design dashboards to track acquisition and repeat use for a cosmetics express initiative targeting Korea-to-U.S./Japan demand</w:t>
       </w:r>
     </w:p>
     <w:p>
@@ -360,7 +360,7 @@
           <w:sz w:val="20"/>
           <w:szCs w:val="20"/>
         </w:rPr>
-        <w:t xml:space="preserve">Project Manager, Group Sales Optimization &amp; Revenue Management (RM) Strategy</w:t>
+        <w:t xml:space="preserve">Project Manager, Group Sales Optimization &amp; Revenue Management Strategy</w:t>
       </w:r>
       <w:r>
         <w:rPr>
@@ -736,7 +736,7 @@
           <w:sz w:val="20"/>
           <w:szCs w:val="20"/>
         </w:rPr>
-        <w:t xml:space="preserve"/>
+        <w:t xml:space="preserve">2023 – Present</w:t>
       </w:r>
     </w:p>
     <w:p>
@@ -816,7 +816,7 @@
           <w:sz w:val="20"/>
           <w:szCs w:val="20"/>
         </w:rPr>
-        <w:t xml:space="preserve"/>
+        <w:t xml:space="preserve">2026 – Present</w:t>
       </w:r>
     </w:p>
     <w:p>

</xml_diff>

<commit_message>
Update Foster resume summary for MSBA focus
</commit_message>
<xml_diff>
--- a/Sukwoo_Chung_Resume_Foster.docx
+++ b/Sukwoo_Chung_Resume_Foster.docx
@@ -52,7 +52,7 @@
           <w:sz w:val="20"/>
           <w:szCs w:val="20"/>
         </w:rPr>
-        <w:t xml:space="preserve">Data &amp; Operations Analyst with experience in airline revenue management, sales analytics, and logistics data. Proven ability to standardize enterprise datasets across six regions and 10 organizations and automate booking workflows. Known for leading cross-functional teams and translating operational data into actionable decisions.</w:t>
+        <w:t xml:space="preserve">Data &amp; Operations Analyst with experience in airline revenue management, sales analytics, and logistics data across Korea and the Philippines. Proven ability to standardize enterprise datasets across six regions and 10 organizations, automate booking workflows, and build predictive models in Python. Known for leading cross-functional teams and communicating data-driven recommendations in Korean and English.</w:t>
       </w:r>
     </w:p>
     <w:p>
@@ -622,7 +622,7 @@
           <w:sz w:val="20"/>
           <w:szCs w:val="20"/>
         </w:rPr>
-        <w:t xml:space="preserve">Renegotiated the International Air Transport Association (IATA) Direct Data Solutions (DDS) contract during COVID-19 ($390K savings); trained sales and planning teams through 74 hours of Data/Business Intelligence (BI) courses</w:t>
+        <w:t xml:space="preserve">Renegotiated the International Air Transport Association (IATA) Direct Data Solutions (DDS) contract during COVID-19 ($390K savings); trained sales and planning teams in Korean and English through 74 hours of Data/Business Intelligence (BI) courses</w:t>
       </w:r>
     </w:p>
     <w:p>

</xml_diff>